<commit_message>
Fix #2085, #2084, #2083, #2081, #2063, #2036, #2096, #1990, #2001, #1901 y #1902
</commit_message>
<xml_diff>
--- a/pwa/files/varios/NOMINA.DE.DESTINATARIOS.docx
+++ b/pwa/files/varios/NOMINA.DE.DESTINATARIOS.docx
@@ -1,6 +1,6 @@
 
 <file path=word/document.xml><?xml version="1.0" encoding="utf-8"?>
-<w:document xmlns:wpc="http://schemas.microsoft.com/office/word/2010/wordprocessingCanvas" xmlns:cx="http://schemas.microsoft.com/office/drawing/2014/chartex" xmlns:cx1="http://schemas.microsoft.com/office/drawing/2015/9/8/chartex" xmlns:cx2="http://schemas.microsoft.com/office/drawing/2015/10/21/chartex" xmlns:cx3="http://schemas.microsoft.com/office/drawing/2016/5/9/chartex" xmlns:cx4="http://schemas.microsoft.com/office/drawing/2016/5/10/chartex" xmlns:cx5="http://schemas.microsoft.com/office/drawing/2016/5/11/chartex" xmlns:cx6="http://schemas.microsoft.com/office/drawing/2016/5/12/chartex" xmlns:cx7="http://schemas.microsoft.com/office/drawing/2016/5/13/chartex" xmlns:cx8="http://schemas.microsoft.com/office/drawing/2016/5/14/chartex" xmlns:mc="http://schemas.openxmlformats.org/markup-compatibility/2006" xmlns:aink="http://schemas.microsoft.com/office/drawing/2016/ink" xmlns:am3d="http://schemas.microsoft.com/office/drawing/2017/model3d" xmlns:o="urn:schemas-microsoft-com:office:office" xmlns:oel="http://schemas.microsoft.com/office/2019/extlst" xmlns:r="http://schemas.openxmlformats.org/officeDocument/2006/relationships" xmlns:m="http://schemas.openxmlformats.org/officeDocument/2006/math" xmlns:v="urn:schemas-microsoft-com:vml" xmlns:wp14="http://schemas.microsoft.com/office/word/2010/wordprocessingDrawing" xmlns:wp="http://schemas.openxmlformats.org/drawingml/2006/wordprocessingDrawing" xmlns:w10="urn:schemas-microsoft-com:office:word" xmlns:w="http://schemas.openxmlformats.org/wordprocessingml/2006/main" xmlns:w14="http://schemas.microsoft.com/office/word/2010/wordml" xmlns:w15="http://schemas.microsoft.com/office/word/2012/wordml" xmlns:w16cex="http://schemas.microsoft.com/office/word/2018/wordml/cex" xmlns:w16cid="http://schemas.microsoft.com/office/word/2016/wordml/cid" xmlns:w16="http://schemas.microsoft.com/office/word/2018/wordml" xmlns:w16sdtdh="http://schemas.microsoft.com/office/word/2020/wordml/sdtdatahash" xmlns:w16se="http://schemas.microsoft.com/office/word/2015/wordml/symex" xmlns:wpg="http://schemas.microsoft.com/office/word/2010/wordprocessingGroup" xmlns:wpi="http://schemas.microsoft.com/office/word/2010/wordprocessingInk" xmlns:wne="http://schemas.microsoft.com/office/word/2006/wordml" xmlns:wps="http://schemas.microsoft.com/office/word/2010/wordprocessingShape" mc:Ignorable="w14 w15 w16se w16cid w16 w16cex w16sdtdh wp14">
+<w:document xmlns:wpc="http://schemas.microsoft.com/office/word/2010/wordprocessingCanvas" xmlns:cx="http://schemas.microsoft.com/office/drawing/2014/chartex" xmlns:mc="http://schemas.openxmlformats.org/markup-compatibility/2006" xmlns:o="urn:schemas-microsoft-com:office:office" xmlns:r="http://schemas.openxmlformats.org/officeDocument/2006/relationships" xmlns:m="http://schemas.openxmlformats.org/officeDocument/2006/math" xmlns:v="urn:schemas-microsoft-com:vml" xmlns:wp14="http://schemas.microsoft.com/office/word/2010/wordprocessingDrawing" xmlns:wp="http://schemas.openxmlformats.org/drawingml/2006/wordprocessingDrawing" xmlns:w10="urn:schemas-microsoft-com:office:word" xmlns:w="http://schemas.openxmlformats.org/wordprocessingml/2006/main" xmlns:w14="http://schemas.microsoft.com/office/word/2010/wordml" xmlns:w15="http://schemas.microsoft.com/office/word/2012/wordml" xmlns:w16se="http://schemas.microsoft.com/office/word/2015/wordml/symex" xmlns:wpg="http://schemas.microsoft.com/office/word/2010/wordprocessingGroup" xmlns:wpi="http://schemas.microsoft.com/office/word/2010/wordprocessingInk" xmlns:wne="http://schemas.microsoft.com/office/word/2006/wordml" xmlns:wps="http://schemas.microsoft.com/office/word/2010/wordprocessingShape" mc:Ignorable="w14 w15 w16se wp14">
   <w:body>
     <w:p>
       <w:pPr>
@@ -14,19 +14,8 @@
           <w:szCs w:val="20"/>
         </w:rPr>
       </w:pPr>
-    </w:p>
-    <w:p>
-      <w:pPr>
-        <w:spacing w:before="240" w:after="200"/>
-        <w:ind w:right="-40"/>
-        <w:jc w:val="center"/>
-        <w:rPr>
-          <w:b/>
-          <w:bCs/>
-          <w:sz w:val="20"/>
-          <w:szCs w:val="20"/>
-        </w:rPr>
-      </w:pPr>
+      <w:bookmarkStart w:id="0" w:name="_GoBack"/>
+      <w:bookmarkEnd w:id="0"/>
       <w:r>
         <w:rPr>
           <w:b/>
@@ -41,28 +30,6 @@
       <w:pPr>
         <w:spacing w:before="240" w:after="200"/>
         <w:ind w:right="-40"/>
-        <w:jc w:val="center"/>
-        <w:rPr>
-          <w:b/>
-          <w:bCs/>
-          <w:sz w:val="20"/>
-          <w:szCs w:val="20"/>
-        </w:rPr>
-      </w:pPr>
-      <w:r>
-        <w:rPr>
-          <w:b/>
-          <w:bCs/>
-          <w:sz w:val="20"/>
-          <w:szCs w:val="20"/>
-        </w:rPr>
-        <w:t>DOCUMENTOS DE GESTIÓN SOCIAL</w:t>
-      </w:r>
-    </w:p>
-    <w:p>
-      <w:pPr>
-        <w:shd w:val="clear" w:color="auto" w:fill="FFFFFF"/>
-        <w:spacing w:before="240" w:after="200"/>
         <w:rPr>
           <w:b/>
           <w:bCs/>
@@ -73,8 +40,8 @@
     </w:p>
     <w:p>
       <w:pPr>
-        <w:shd w:val="clear" w:color="auto" w:fill="FFFFFF"/>
         <w:spacing w:before="240" w:after="200"/>
+        <w:ind w:right="-40"/>
         <w:rPr>
           <w:b/>
           <w:bCs/>
@@ -89,7 +56,7 @@
           <w:sz w:val="20"/>
           <w:szCs w:val="20"/>
         </w:rPr>
-        <w:t>II - NÓMINA DE DESTINATARIOS</w:t>
+        <w:t>II -PROGRAMA ALIMENTAR COMUNIDAD-  REPORTE DE GESTIÓN SOCIAL - “NÓMINA DE DESTINATARIOS”</w:t>
       </w:r>
     </w:p>
     <w:p>
@@ -132,7 +99,7 @@
           <w:sz w:val="20"/>
           <w:szCs w:val="20"/>
         </w:rPr>
-        <w:t xml:space="preserve">NOMBRE DEL COMEDOR/MERENDERO: </w:t>
+        <w:t xml:space="preserve">NOMBRE DEL ESPACIO: </w:t>
       </w:r>
     </w:p>
     <w:p>
@@ -163,6 +130,35 @@
         <w:spacing w:before="240" w:after="200"/>
         <w:jc w:val="both"/>
         <w:rPr>
+          <w:sz w:val="20"/>
+          <w:szCs w:val="20"/>
+        </w:rPr>
+      </w:pPr>
+      <w:r>
+        <w:rPr>
+          <w:b/>
+          <w:bCs/>
+          <w:sz w:val="20"/>
+          <w:szCs w:val="20"/>
+        </w:rPr>
+        <w:t xml:space="preserve">MES:                     </w:t>
+      </w:r>
+      <w:r>
+        <w:rPr>
+          <w:b/>
+          <w:bCs/>
+          <w:sz w:val="20"/>
+          <w:szCs w:val="20"/>
+        </w:rPr>
+        <w:t xml:space="preserve">                   AÑO:   </w:t>
+      </w:r>
+    </w:p>
+    <w:p>
+      <w:pPr>
+        <w:shd w:val="clear" w:color="auto" w:fill="FFFFFF"/>
+        <w:spacing w:before="240" w:after="200"/>
+        <w:jc w:val="both"/>
+        <w:rPr>
           <w:b/>
           <w:bCs/>
           <w:sz w:val="20"/>
@@ -182,9 +178,10 @@
     <w:sdt>
       <w:sdtPr>
         <w:tag w:val="goog_rdk_1"/>
-        <w:id w:val="745933983"/>
+        <w:id w:val="-1228632246"/>
         <w:lock w:val="contentLocked"/>
       </w:sdtPr>
+      <w:sdtEndPr/>
       <w:sdtContent>
         <w:tbl>
           <w:tblPr>
@@ -203,8 +200,8 @@
             <w:tblLook w:val="0600" w:firstRow="0" w:lastRow="0" w:firstColumn="0" w:lastColumn="0" w:noHBand="1" w:noVBand="1"/>
           </w:tblPr>
           <w:tblGrid>
-            <w:gridCol w:w="1275"/>
-            <w:gridCol w:w="1245"/>
+            <w:gridCol w:w="1170"/>
+            <w:gridCol w:w="1350"/>
             <w:gridCol w:w="1335"/>
             <w:gridCol w:w="1020"/>
             <w:gridCol w:w="1335"/>
@@ -218,7 +215,7 @@
             </w:trPr>
             <w:tc>
               <w:tcPr>
-                <w:tcW w:w="1275" w:type="dxa"/>
+                <w:tcW w:w="1170" w:type="dxa"/>
                 <w:vMerge w:val="restart"/>
                 <w:shd w:val="clear" w:color="auto" w:fill="auto"/>
                 <w:tcMar>
@@ -259,7 +256,7 @@
             </w:tc>
             <w:tc>
               <w:tcPr>
-                <w:tcW w:w="1245" w:type="dxa"/>
+                <w:tcW w:w="1350" w:type="dxa"/>
                 <w:vMerge w:val="restart"/>
                 <w:shd w:val="clear" w:color="auto" w:fill="auto"/>
                 <w:tcMar>
@@ -498,7 +495,7 @@
             </w:trPr>
             <w:tc>
               <w:tcPr>
-                <w:tcW w:w="1275" w:type="dxa"/>
+                <w:tcW w:w="1170" w:type="dxa"/>
                 <w:vMerge/>
                 <w:shd w:val="clear" w:color="auto" w:fill="auto"/>
                 <w:tcMar>
@@ -530,7 +527,7 @@
             </w:tc>
             <w:tc>
               <w:tcPr>
-                <w:tcW w:w="1245" w:type="dxa"/>
+                <w:tcW w:w="1350" w:type="dxa"/>
                 <w:vMerge/>
                 <w:shd w:val="clear" w:color="auto" w:fill="auto"/>
                 <w:tcMar>
@@ -780,7 +777,7 @@
           <w:tr>
             <w:tc>
               <w:tcPr>
-                <w:tcW w:w="1275" w:type="dxa"/>
+                <w:tcW w:w="1170" w:type="dxa"/>
                 <w:shd w:val="clear" w:color="auto" w:fill="auto"/>
                 <w:tcMar>
                   <w:top w:w="100" w:type="dxa"/>
@@ -820,7 +817,7 @@
             </w:tc>
             <w:tc>
               <w:tcPr>
-                <w:tcW w:w="1245" w:type="dxa"/>
+                <w:tcW w:w="1350" w:type="dxa"/>
                 <w:shd w:val="clear" w:color="auto" w:fill="auto"/>
                 <w:tcMar>
                   <w:top w:w="100" w:type="dxa"/>
@@ -1039,7 +1036,7 @@
           <w:tr>
             <w:tc>
               <w:tcPr>
-                <w:tcW w:w="1275" w:type="dxa"/>
+                <w:tcW w:w="1170" w:type="dxa"/>
                 <w:shd w:val="clear" w:color="auto" w:fill="auto"/>
                 <w:tcMar>
                   <w:top w:w="100" w:type="dxa"/>
@@ -1079,7 +1076,7 @@
             </w:tc>
             <w:tc>
               <w:tcPr>
-                <w:tcW w:w="1245" w:type="dxa"/>
+                <w:tcW w:w="1350" w:type="dxa"/>
                 <w:shd w:val="clear" w:color="auto" w:fill="auto"/>
                 <w:tcMar>
                   <w:top w:w="100" w:type="dxa"/>
@@ -1298,7 +1295,7 @@
           <w:tr>
             <w:tc>
               <w:tcPr>
-                <w:tcW w:w="1275" w:type="dxa"/>
+                <w:tcW w:w="1170" w:type="dxa"/>
                 <w:shd w:val="clear" w:color="auto" w:fill="auto"/>
                 <w:tcMar>
                   <w:top w:w="100" w:type="dxa"/>
@@ -1338,7 +1335,7 @@
             </w:tc>
             <w:tc>
               <w:tcPr>
-                <w:tcW w:w="1245" w:type="dxa"/>
+                <w:tcW w:w="1350" w:type="dxa"/>
                 <w:shd w:val="clear" w:color="auto" w:fill="auto"/>
                 <w:tcMar>
                   <w:top w:w="100" w:type="dxa"/>
@@ -1560,157 +1557,145 @@
     <w:p>
       <w:pPr>
         <w:spacing w:before="200" w:after="200"/>
-        <w:ind w:left="283" w:right="-40"/>
-        <w:jc w:val="center"/>
-        <w:rPr>
-          <w:b/>
-          <w:bCs/>
-          <w:sz w:val="24"/>
-          <w:szCs w:val="24"/>
+        <w:ind w:right="-40"/>
+        <w:jc w:val="both"/>
+        <w:rPr>
+          <w:sz w:val="20"/>
+          <w:szCs w:val="20"/>
+          <w:u w:val="single"/>
         </w:rPr>
       </w:pPr>
     </w:p>
     <w:p>
       <w:pPr>
-        <w:spacing w:before="240" w:after="200"/>
-        <w:ind w:right="98"/>
+        <w:spacing w:before="200" w:after="200"/>
+        <w:ind w:right="-40"/>
         <w:jc w:val="both"/>
         <w:rPr>
-          <w:rFonts w:eastAsia="Calibri"/>
           <w:sz w:val="20"/>
           <w:szCs w:val="20"/>
         </w:rPr>
       </w:pPr>
       <w:r>
         <w:rPr>
-          <w:rFonts w:ascii="Segoe UI Symbol" w:eastAsia="Calibri" w:hAnsi="Segoe UI Symbol" w:cs="Segoe UI Symbol"/>
-          <w:sz w:val="20"/>
-          <w:szCs w:val="20"/>
-        </w:rPr>
-        <w:t>🗹</w:t>
-      </w:r>
-      <w:r>
-        <w:rPr>
-          <w:rFonts w:eastAsia="Calibri"/>
-          <w:sz w:val="20"/>
-          <w:szCs w:val="20"/>
-        </w:rPr>
-        <w:t xml:space="preserve"> [</w:t>
-      </w:r>
-      <w:proofErr w:type="spellStart"/>
-      <w:r>
-        <w:rPr>
-          <w:rFonts w:eastAsia="Calibri"/>
-          <w:sz w:val="20"/>
-          <w:szCs w:val="20"/>
-        </w:rPr>
-        <w:t>Aca</w:t>
-      </w:r>
-      <w:proofErr w:type="spellEnd"/>
-      <w:r>
-        <w:rPr>
-          <w:rFonts w:eastAsia="Calibri"/>
-          <w:sz w:val="20"/>
-          <w:szCs w:val="20"/>
-        </w:rPr>
-        <w:t xml:space="preserve"> va </w:t>
-      </w:r>
-      <w:r>
-        <w:rPr>
-          <w:rFonts w:eastAsia="Calibri"/>
-          <w:sz w:val="20"/>
-          <w:szCs w:val="20"/>
-        </w:rPr>
-        <w:t xml:space="preserve">texto que nos va a enviar el programa, que resulta ser una DDJJ del tipo “Declaro que los datos son verídicos y _____________”. Preparar </w:t>
-      </w:r>
-      <w:proofErr w:type="spellStart"/>
-      <w:r>
-        <w:rPr>
-          <w:rFonts w:eastAsia="Calibri"/>
-          <w:sz w:val="20"/>
-          <w:szCs w:val="20"/>
-        </w:rPr>
-        <w:t>template</w:t>
-      </w:r>
-      <w:proofErr w:type="spellEnd"/>
-      <w:r>
-        <w:rPr>
-          <w:rFonts w:eastAsia="Calibri"/>
-          <w:sz w:val="20"/>
-          <w:szCs w:val="20"/>
-        </w:rPr>
-        <w:t xml:space="preserve"> para mostrar nombre de usuario </w:t>
-      </w:r>
-      <w:proofErr w:type="spellStart"/>
-      <w:r>
-        <w:rPr>
-          <w:rFonts w:eastAsia="Calibri"/>
-          <w:sz w:val="20"/>
-          <w:szCs w:val="20"/>
-        </w:rPr>
-        <w:t>generadory</w:t>
-      </w:r>
-      <w:proofErr w:type="spellEnd"/>
-      <w:r>
-        <w:rPr>
-          <w:rFonts w:eastAsia="Calibri"/>
-          <w:sz w:val="20"/>
-          <w:szCs w:val="20"/>
-        </w:rPr>
-        <w:t xml:space="preserve"> fecha que lo generó. Si necesitan </w:t>
-      </w:r>
-      <w:proofErr w:type="spellStart"/>
-      <w:r>
-        <w:rPr>
-          <w:rFonts w:eastAsia="Calibri"/>
-          <w:sz w:val="20"/>
-          <w:szCs w:val="20"/>
-        </w:rPr>
-        <w:t>mas</w:t>
-      </w:r>
-      <w:proofErr w:type="spellEnd"/>
-      <w:r>
-        <w:rPr>
-          <w:rFonts w:eastAsia="Calibri"/>
-          <w:sz w:val="20"/>
-          <w:szCs w:val="20"/>
-        </w:rPr>
-        <w:t xml:space="preserve"> </w:t>
-      </w:r>
-      <w:proofErr w:type="spellStart"/>
-      <w:r>
-        <w:rPr>
-          <w:rFonts w:eastAsia="Calibri"/>
-          <w:sz w:val="20"/>
-          <w:szCs w:val="20"/>
-        </w:rPr>
-        <w:t>cs</w:t>
-      </w:r>
-      <w:proofErr w:type="spellEnd"/>
-      <w:r>
-        <w:rPr>
-          <w:rFonts w:eastAsia="Calibri"/>
-          <w:sz w:val="20"/>
-          <w:szCs w:val="20"/>
-        </w:rPr>
-        <w:t>]</w:t>
+          <w:sz w:val="20"/>
+          <w:szCs w:val="20"/>
+        </w:rPr>
+        <w:t>Se deja constancia que los datos consignados precedentemente han sido integrados al SISTEMA SISOC por el Usuario habilitado consignado a continuación, y bajo carácter de DECLARACIÓN JURADA.</w:t>
       </w:r>
     </w:p>
     <w:p>
       <w:pPr>
-        <w:spacing w:after="200"/>
-        <w:ind w:right="-891"/>
-        <w:jc w:val="center"/>
+        <w:spacing w:before="200" w:after="200"/>
+        <w:ind w:right="-40"/>
+        <w:jc w:val="both"/>
+        <w:rPr>
+          <w:sz w:val="20"/>
+          <w:szCs w:val="20"/>
+          <w:u w:val="single"/>
+        </w:rPr>
+      </w:pPr>
+    </w:p>
+    <w:p>
+      <w:pPr>
+        <w:spacing w:before="200" w:after="200"/>
+        <w:ind w:right="-40"/>
+        <w:jc w:val="both"/>
+        <w:rPr>
+          <w:sz w:val="20"/>
+          <w:szCs w:val="20"/>
+          <w:u w:val="single"/>
+        </w:rPr>
+      </w:pPr>
+    </w:p>
+    <w:p>
+      <w:pPr>
+        <w:spacing w:before="200" w:after="200"/>
+        <w:ind w:right="-40"/>
+        <w:jc w:val="both"/>
+        <w:rPr>
+          <w:sz w:val="20"/>
+          <w:szCs w:val="20"/>
+          <w:u w:val="single"/>
+        </w:rPr>
+      </w:pPr>
+    </w:p>
+    <w:p>
+      <w:pPr>
+        <w:spacing w:before="200" w:after="200"/>
+        <w:ind w:right="-40"/>
+        <w:jc w:val="both"/>
+        <w:rPr>
+          <w:sz w:val="20"/>
+          <w:szCs w:val="20"/>
+        </w:rPr>
+      </w:pPr>
+    </w:p>
+    <w:p>
+      <w:pPr>
+        <w:spacing w:before="200" w:after="200"/>
+        <w:ind w:right="-40"/>
         <w:rPr>
           <w:b/>
           <w:bCs/>
-          <w:sz w:val="24"/>
-          <w:szCs w:val="24"/>
+          <w:sz w:val="20"/>
+          <w:szCs w:val="20"/>
         </w:rPr>
       </w:pPr>
+      <w:r>
+        <w:rPr>
+          <w:b/>
+          <w:bCs/>
+          <w:sz w:val="20"/>
+          <w:szCs w:val="20"/>
+        </w:rPr>
+        <w:t>Usuario</w:t>
+      </w:r>
+    </w:p>
+    <w:p>
+      <w:pPr>
+        <w:spacing w:before="200" w:after="200"/>
+        <w:ind w:right="-40"/>
+        <w:rPr>
+          <w:b/>
+          <w:bCs/>
+          <w:sz w:val="20"/>
+          <w:szCs w:val="20"/>
+        </w:rPr>
+      </w:pPr>
+      <w:r>
+        <w:rPr>
+          <w:b/>
+          <w:bCs/>
+          <w:sz w:val="20"/>
+          <w:szCs w:val="20"/>
+        </w:rPr>
+        <w:t>Apellido y nombre</w:t>
+      </w:r>
+    </w:p>
+    <w:p>
+      <w:pPr>
+        <w:spacing w:before="200" w:after="200"/>
+        <w:ind w:right="-40"/>
+        <w:rPr>
+          <w:b/>
+          <w:bCs/>
+          <w:sz w:val="20"/>
+          <w:szCs w:val="20"/>
+        </w:rPr>
+      </w:pPr>
+      <w:r>
+        <w:rPr>
+          <w:b/>
+          <w:bCs/>
+          <w:sz w:val="20"/>
+          <w:szCs w:val="20"/>
+        </w:rPr>
+        <w:t xml:space="preserve">DNI </w:t>
+      </w:r>
     </w:p>
     <w:sectPr>
-      <w:headerReference w:type="default" r:id="rId7"/>
+      <w:headerReference w:type="default" r:id="rId8"/>
       <w:pgSz w:w="11909" w:h="16834"/>
       <w:pgMar w:top="1440" w:right="1440" w:bottom="1440" w:left="1440" w:header="720" w:footer="720" w:gutter="0"/>
       <w:pgNumType w:start="1"/>
@@ -1721,7 +1706,7 @@
 </file>
 
 <file path=word/endnotes.xml><?xml version="1.0" encoding="utf-8"?>
-<w:endnotes xmlns:wpc="http://schemas.microsoft.com/office/word/2010/wordprocessingCanvas" xmlns:cx="http://schemas.microsoft.com/office/drawing/2014/chartex" xmlns:cx1="http://schemas.microsoft.com/office/drawing/2015/9/8/chartex" xmlns:cx2="http://schemas.microsoft.com/office/drawing/2015/10/21/chartex" xmlns:cx3="http://schemas.microsoft.com/office/drawing/2016/5/9/chartex" xmlns:cx4="http://schemas.microsoft.com/office/drawing/2016/5/10/chartex" xmlns:cx5="http://schemas.microsoft.com/office/drawing/2016/5/11/chartex" xmlns:cx6="http://schemas.microsoft.com/office/drawing/2016/5/12/chartex" xmlns:cx7="http://schemas.microsoft.com/office/drawing/2016/5/13/chartex" xmlns:cx8="http://schemas.microsoft.com/office/drawing/2016/5/14/chartex" xmlns:mc="http://schemas.openxmlformats.org/markup-compatibility/2006" xmlns:aink="http://schemas.microsoft.com/office/drawing/2016/ink" xmlns:am3d="http://schemas.microsoft.com/office/drawing/2017/model3d" xmlns:o="urn:schemas-microsoft-com:office:office" xmlns:oel="http://schemas.microsoft.com/office/2019/extlst" xmlns:r="http://schemas.openxmlformats.org/officeDocument/2006/relationships" xmlns:m="http://schemas.openxmlformats.org/officeDocument/2006/math" xmlns:v="urn:schemas-microsoft-com:vml" xmlns:wp14="http://schemas.microsoft.com/office/word/2010/wordprocessingDrawing" xmlns:wp="http://schemas.openxmlformats.org/drawingml/2006/wordprocessingDrawing" xmlns:w10="urn:schemas-microsoft-com:office:word" xmlns:w="http://schemas.openxmlformats.org/wordprocessingml/2006/main" xmlns:w14="http://schemas.microsoft.com/office/word/2010/wordml" xmlns:w15="http://schemas.microsoft.com/office/word/2012/wordml" xmlns:w16cex="http://schemas.microsoft.com/office/word/2018/wordml/cex" xmlns:w16cid="http://schemas.microsoft.com/office/word/2016/wordml/cid" xmlns:w16="http://schemas.microsoft.com/office/word/2018/wordml" xmlns:w16sdtdh="http://schemas.microsoft.com/office/word/2020/wordml/sdtdatahash" xmlns:w16se="http://schemas.microsoft.com/office/word/2015/wordml/symex" xmlns:wpg="http://schemas.microsoft.com/office/word/2010/wordprocessingGroup" xmlns:wpi="http://schemas.microsoft.com/office/word/2010/wordprocessingInk" xmlns:wne="http://schemas.microsoft.com/office/word/2006/wordml" xmlns:wps="http://schemas.microsoft.com/office/word/2010/wordprocessingShape" mc:Ignorable="w14 w15 w16se w16cid w16 w16cex w16sdtdh wp14">
+<w:endnotes xmlns:wpc="http://schemas.microsoft.com/office/word/2010/wordprocessingCanvas" xmlns:cx="http://schemas.microsoft.com/office/drawing/2014/chartex" xmlns:mc="http://schemas.openxmlformats.org/markup-compatibility/2006" xmlns:o="urn:schemas-microsoft-com:office:office" xmlns:r="http://schemas.openxmlformats.org/officeDocument/2006/relationships" xmlns:m="http://schemas.openxmlformats.org/officeDocument/2006/math" xmlns:v="urn:schemas-microsoft-com:vml" xmlns:wp14="http://schemas.microsoft.com/office/word/2010/wordprocessingDrawing" xmlns:wp="http://schemas.openxmlformats.org/drawingml/2006/wordprocessingDrawing" xmlns:w10="urn:schemas-microsoft-com:office:word" xmlns:w="http://schemas.openxmlformats.org/wordprocessingml/2006/main" xmlns:w14="http://schemas.microsoft.com/office/word/2010/wordml" xmlns:w15="http://schemas.microsoft.com/office/word/2012/wordml" xmlns:w16se="http://schemas.microsoft.com/office/word/2015/wordml/symex" xmlns:wpg="http://schemas.microsoft.com/office/word/2010/wordprocessingGroup" xmlns:wpi="http://schemas.microsoft.com/office/word/2010/wordprocessingInk" xmlns:wne="http://schemas.microsoft.com/office/word/2006/wordml" xmlns:wps="http://schemas.microsoft.com/office/word/2010/wordprocessingShape" mc:Ignorable="w14 w15 w16se wp14">
   <w:endnote w:type="separator" w:id="-1">
     <w:p>
       <w:pPr>
@@ -1746,7 +1731,7 @@
 </file>
 
 <file path=word/footnotes.xml><?xml version="1.0" encoding="utf-8"?>
-<w:footnotes xmlns:wpc="http://schemas.microsoft.com/office/word/2010/wordprocessingCanvas" xmlns:cx="http://schemas.microsoft.com/office/drawing/2014/chartex" xmlns:cx1="http://schemas.microsoft.com/office/drawing/2015/9/8/chartex" xmlns:cx2="http://schemas.microsoft.com/office/drawing/2015/10/21/chartex" xmlns:cx3="http://schemas.microsoft.com/office/drawing/2016/5/9/chartex" xmlns:cx4="http://schemas.microsoft.com/office/drawing/2016/5/10/chartex" xmlns:cx5="http://schemas.microsoft.com/office/drawing/2016/5/11/chartex" xmlns:cx6="http://schemas.microsoft.com/office/drawing/2016/5/12/chartex" xmlns:cx7="http://schemas.microsoft.com/office/drawing/2016/5/13/chartex" xmlns:cx8="http://schemas.microsoft.com/office/drawing/2016/5/14/chartex" xmlns:mc="http://schemas.openxmlformats.org/markup-compatibility/2006" xmlns:aink="http://schemas.microsoft.com/office/drawing/2016/ink" xmlns:am3d="http://schemas.microsoft.com/office/drawing/2017/model3d" xmlns:o="urn:schemas-microsoft-com:office:office" xmlns:oel="http://schemas.microsoft.com/office/2019/extlst" xmlns:r="http://schemas.openxmlformats.org/officeDocument/2006/relationships" xmlns:m="http://schemas.openxmlformats.org/officeDocument/2006/math" xmlns:v="urn:schemas-microsoft-com:vml" xmlns:wp14="http://schemas.microsoft.com/office/word/2010/wordprocessingDrawing" xmlns:wp="http://schemas.openxmlformats.org/drawingml/2006/wordprocessingDrawing" xmlns:w10="urn:schemas-microsoft-com:office:word" xmlns:w="http://schemas.openxmlformats.org/wordprocessingml/2006/main" xmlns:w14="http://schemas.microsoft.com/office/word/2010/wordml" xmlns:w15="http://schemas.microsoft.com/office/word/2012/wordml" xmlns:w16cex="http://schemas.microsoft.com/office/word/2018/wordml/cex" xmlns:w16cid="http://schemas.microsoft.com/office/word/2016/wordml/cid" xmlns:w16="http://schemas.microsoft.com/office/word/2018/wordml" xmlns:w16sdtdh="http://schemas.microsoft.com/office/word/2020/wordml/sdtdatahash" xmlns:w16se="http://schemas.microsoft.com/office/word/2015/wordml/symex" xmlns:wpg="http://schemas.microsoft.com/office/word/2010/wordprocessingGroup" xmlns:wpi="http://schemas.microsoft.com/office/word/2010/wordprocessingInk" xmlns:wne="http://schemas.microsoft.com/office/word/2006/wordml" xmlns:wps="http://schemas.microsoft.com/office/word/2010/wordprocessingShape" mc:Ignorable="w14 w15 w16se w16cid w16 w16cex w16sdtdh wp14">
+<w:footnotes xmlns:wpc="http://schemas.microsoft.com/office/word/2010/wordprocessingCanvas" xmlns:cx="http://schemas.microsoft.com/office/drawing/2014/chartex" xmlns:mc="http://schemas.openxmlformats.org/markup-compatibility/2006" xmlns:o="urn:schemas-microsoft-com:office:office" xmlns:r="http://schemas.openxmlformats.org/officeDocument/2006/relationships" xmlns:m="http://schemas.openxmlformats.org/officeDocument/2006/math" xmlns:v="urn:schemas-microsoft-com:vml" xmlns:wp14="http://schemas.microsoft.com/office/word/2010/wordprocessingDrawing" xmlns:wp="http://schemas.openxmlformats.org/drawingml/2006/wordprocessingDrawing" xmlns:w10="urn:schemas-microsoft-com:office:word" xmlns:w="http://schemas.openxmlformats.org/wordprocessingml/2006/main" xmlns:w14="http://schemas.microsoft.com/office/word/2010/wordml" xmlns:w15="http://schemas.microsoft.com/office/word/2012/wordml" xmlns:w16se="http://schemas.microsoft.com/office/word/2015/wordml/symex" xmlns:wpg="http://schemas.microsoft.com/office/word/2010/wordprocessingGroup" xmlns:wpi="http://schemas.microsoft.com/office/word/2010/wordprocessingInk" xmlns:wne="http://schemas.microsoft.com/office/word/2006/wordml" xmlns:wps="http://schemas.microsoft.com/office/word/2010/wordprocessingShape" mc:Ignorable="w14 w15 w16se wp14">
   <w:footnote w:type="separator" w:id="-1">
     <w:p>
       <w:pPr>
@@ -1771,195 +1756,7 @@
 </file>
 
 <file path=word/header1.xml><?xml version="1.0" encoding="utf-8"?>
-<w:hdr xmlns:wpc="http://schemas.microsoft.com/office/word/2010/wordprocessingCanvas" xmlns:cx="http://schemas.microsoft.com/office/drawing/2014/chartex" xmlns:cx1="http://schemas.microsoft.com/office/drawing/2015/9/8/chartex" xmlns:cx2="http://schemas.microsoft.com/office/drawing/2015/10/21/chartex" xmlns:cx3="http://schemas.microsoft.com/office/drawing/2016/5/9/chartex" xmlns:cx4="http://schemas.microsoft.com/office/drawing/2016/5/10/chartex" xmlns:cx5="http://schemas.microsoft.com/office/drawing/2016/5/11/chartex" xmlns:cx6="http://schemas.microsoft.com/office/drawing/2016/5/12/chartex" xmlns:cx7="http://schemas.microsoft.com/office/drawing/2016/5/13/chartex" xmlns:cx8="http://schemas.microsoft.com/office/drawing/2016/5/14/chartex" xmlns:mc="http://schemas.openxmlformats.org/markup-compatibility/2006" xmlns:aink="http://schemas.microsoft.com/office/drawing/2016/ink" xmlns:am3d="http://schemas.microsoft.com/office/drawing/2017/model3d" xmlns:o="urn:schemas-microsoft-com:office:office" xmlns:oel="http://schemas.microsoft.com/office/2019/extlst" xmlns:r="http://schemas.openxmlformats.org/officeDocument/2006/relationships" xmlns:m="http://schemas.openxmlformats.org/officeDocument/2006/math" xmlns:v="urn:schemas-microsoft-com:vml" xmlns:wp14="http://schemas.microsoft.com/office/word/2010/wordprocessingDrawing" xmlns:wp="http://schemas.openxmlformats.org/drawingml/2006/wordprocessingDrawing" xmlns:w10="urn:schemas-microsoft-com:office:word" xmlns:w="http://schemas.openxmlformats.org/wordprocessingml/2006/main" xmlns:w14="http://schemas.microsoft.com/office/word/2010/wordml" xmlns:w15="http://schemas.microsoft.com/office/word/2012/wordml" xmlns:w16cex="http://schemas.microsoft.com/office/word/2018/wordml/cex" xmlns:w16cid="http://schemas.microsoft.com/office/word/2016/wordml/cid" xmlns:w16="http://schemas.microsoft.com/office/word/2018/wordml" xmlns:w16sdtdh="http://schemas.microsoft.com/office/word/2020/wordml/sdtdatahash" xmlns:w16se="http://schemas.microsoft.com/office/word/2015/wordml/symex" xmlns:wpg="http://schemas.microsoft.com/office/word/2010/wordprocessingGroup" xmlns:wpi="http://schemas.microsoft.com/office/word/2010/wordprocessingInk" xmlns:wne="http://schemas.microsoft.com/office/word/2006/wordml" xmlns:wps="http://schemas.microsoft.com/office/word/2010/wordprocessingShape" mc:Ignorable="w14 w15 w16se w16cid w16 w16cex w16sdtdh wp14">
-  <w:p>
-    <w:pPr>
-      <w:widowControl w:val="0"/>
-      <w:rPr>
-        <w:rFonts w:ascii="Calibri" w:eastAsia="Calibri" w:hAnsi="Calibri" w:cs="Calibri"/>
-      </w:rPr>
-    </w:pPr>
-  </w:p>
-  <w:tbl>
-    <w:tblPr>
-      <w:tblStyle w:val="a1"/>
-      <w:tblW w:w="10640" w:type="dxa"/>
-      <w:tblInd w:w="-235" w:type="dxa"/>
-      <w:tblLayout w:type="fixed"/>
-      <w:tblLook w:val="0400" w:firstRow="0" w:lastRow="0" w:firstColumn="0" w:lastColumn="0" w:noHBand="0" w:noVBand="1"/>
-    </w:tblPr>
-    <w:tblGrid>
-      <w:gridCol w:w="3340"/>
-      <w:gridCol w:w="7300"/>
-    </w:tblGrid>
-    <w:tr>
-      <w:trPr>
-        <w:trHeight w:val="1260"/>
-      </w:trPr>
-      <w:tc>
-        <w:tcPr>
-          <w:tcW w:w="3340" w:type="dxa"/>
-          <w:tcMar>
-            <w:top w:w="0" w:type="dxa"/>
-            <w:left w:w="70" w:type="dxa"/>
-            <w:bottom w:w="0" w:type="dxa"/>
-            <w:right w:w="70" w:type="dxa"/>
-          </w:tcMar>
-        </w:tcPr>
-        <w:p>
-          <w:pPr>
-            <w:spacing w:line="240" w:lineRule="auto"/>
-            <w:ind w:left="141" w:right="1019"/>
-            <w:jc w:val="center"/>
-            <w:rPr>
-              <w:rFonts w:ascii="Times New Roman" w:eastAsia="Times New Roman" w:hAnsi="Times New Roman" w:cs="Times New Roman"/>
-              <w:sz w:val="24"/>
-              <w:szCs w:val="24"/>
-            </w:rPr>
-          </w:pPr>
-          <w:r>
-            <w:rPr>
-              <w:rFonts w:ascii="Calibri" w:eastAsia="Calibri" w:hAnsi="Calibri" w:cs="Calibri"/>
-            </w:rPr>
-            <w:t xml:space="preserve">          </w:t>
-          </w:r>
-          <w:r>
-            <w:rPr>
-              <w:rFonts w:ascii="Calibri" w:eastAsia="Calibri" w:hAnsi="Calibri" w:cs="Calibri"/>
-              <w:noProof/>
-              <w:lang w:val="es-AR"/>
-            </w:rPr>
-            <w:drawing>
-              <wp:inline distT="0" distB="0" distL="0" distR="0" wp14:anchorId="61AF1F7B" wp14:editId="165797AA">
-                <wp:extent cx="523875" cy="628650"/>
-                <wp:effectExtent l="0" t="0" r="0" b="0"/>
-                <wp:docPr id="1" name="image1.png" descr="https://lh4.googleusercontent.com/_BPpMZcufOcDbjOvOp4Tp7dswX05T9Y4mLZ2VgjUVQ8qgpWXGDZ56n0as-cZeRErS52wSFzZ2l_VexxDNSoVXKLNJGHbwC_gfNBlrFm1-fMhWUQSBEjAnSjBQrMFpaih7UjUbJyuLQXWeKu0DCmb6ezEv6Q0s5ItPK1iVoA8FtPUXOgBcQYit-dNmy6vp3soCwiHCMmEhQ"/>
-                <wp:cNvGraphicFramePr/>
-                <a:graphic xmlns:a="http://schemas.openxmlformats.org/drawingml/2006/main">
-                  <a:graphicData uri="http://schemas.openxmlformats.org/drawingml/2006/picture">
-                    <pic:pic xmlns:pic="http://schemas.openxmlformats.org/drawingml/2006/picture">
-                      <pic:nvPicPr>
-                        <pic:cNvPr id="0" name="image1.png" descr="https://lh4.googleusercontent.com/_BPpMZcufOcDbjOvOp4Tp7dswX05T9Y4mLZ2VgjUVQ8qgpWXGDZ56n0as-cZeRErS52wSFzZ2l_VexxDNSoVXKLNJGHbwC_gfNBlrFm1-fMhWUQSBEjAnSjBQrMFpaih7UjUbJyuLQXWeKu0DCmb6ezEv6Q0s5ItPK1iVoA8FtPUXOgBcQYit-dNmy6vp3soCwiHCMmEhQ"/>
-                        <pic:cNvPicPr preferRelativeResize="0"/>
-                      </pic:nvPicPr>
-                      <pic:blipFill>
-                        <a:blip r:embed="rId1"/>
-                        <a:srcRect/>
-                        <a:stretch>
-                          <a:fillRect/>
-                        </a:stretch>
-                      </pic:blipFill>
-                      <pic:spPr>
-                        <a:xfrm>
-                          <a:off x="0" y="0"/>
-                          <a:ext cx="523875" cy="628650"/>
-                        </a:xfrm>
-                        <a:prstGeom prst="rect">
-                          <a:avLst/>
-                        </a:prstGeom>
-                        <a:ln/>
-                      </pic:spPr>
-                    </pic:pic>
-                  </a:graphicData>
-                </a:graphic>
-              </wp:inline>
-            </w:drawing>
-          </w:r>
-        </w:p>
-        <w:p>
-          <w:pPr>
-            <w:spacing w:line="240" w:lineRule="auto"/>
-            <w:ind w:left="141" w:right="-348"/>
-            <w:rPr>
-              <w:rFonts w:ascii="Times New Roman" w:eastAsia="Times New Roman" w:hAnsi="Times New Roman" w:cs="Times New Roman"/>
-              <w:sz w:val="24"/>
-              <w:szCs w:val="24"/>
-            </w:rPr>
-          </w:pPr>
-          <w:r>
-            <w:rPr>
-              <w:rFonts w:ascii="ShelleyAllegro BT" w:eastAsia="ShelleyAllegro BT" w:hAnsi="ShelleyAllegro BT" w:cs="ShelleyAllegro BT"/>
-              <w:sz w:val="24"/>
-              <w:szCs w:val="24"/>
-            </w:rPr>
-            <w:t xml:space="preserve">Ministerio de Capital Humano </w:t>
-          </w:r>
-        </w:p>
-      </w:tc>
-      <w:tc>
-        <w:tcPr>
-          <w:tcW w:w="7300" w:type="dxa"/>
-          <w:tcMar>
-            <w:top w:w="0" w:type="dxa"/>
-            <w:left w:w="70" w:type="dxa"/>
-            <w:bottom w:w="0" w:type="dxa"/>
-            <w:right w:w="70" w:type="dxa"/>
-          </w:tcMar>
-        </w:tcPr>
-        <w:p>
-          <w:pPr>
-            <w:shd w:val="clear" w:color="auto" w:fill="FFFFFF"/>
-            <w:spacing w:line="240" w:lineRule="auto"/>
-            <w:jc w:val="right"/>
-            <w:rPr>
-              <w:rFonts w:ascii="Calibri" w:eastAsia="Calibri" w:hAnsi="Calibri" w:cs="Calibri"/>
-              <w:sz w:val="20"/>
-              <w:szCs w:val="20"/>
-            </w:rPr>
-          </w:pPr>
-          <w:r>
-            <w:rPr>
-              <w:rFonts w:ascii="Calibri" w:eastAsia="Calibri" w:hAnsi="Calibri" w:cs="Calibri"/>
-              <w:sz w:val="20"/>
-              <w:szCs w:val="20"/>
-            </w:rPr>
-            <w:tab/>
-          </w:r>
-          <w:r>
-            <w:rPr>
-              <w:rFonts w:ascii="Calibri" w:eastAsia="Calibri" w:hAnsi="Calibri" w:cs="Calibri"/>
-              <w:sz w:val="20"/>
-              <w:szCs w:val="20"/>
-            </w:rPr>
-            <w:tab/>
-            <w:t xml:space="preserve">               </w:t>
-          </w:r>
-        </w:p>
-        <w:p>
-          <w:pPr>
-            <w:ind w:left="-212" w:right="-70"/>
-            <w:jc w:val="right"/>
-            <w:rPr>
-              <w:rFonts w:ascii="Calibri" w:eastAsia="Calibri" w:hAnsi="Calibri" w:cs="Calibri"/>
-              <w:color w:val="212121"/>
-              <w:sz w:val="23"/>
-              <w:szCs w:val="23"/>
-            </w:rPr>
-          </w:pPr>
-        </w:p>
-        <w:p>
-          <w:pPr>
-            <w:ind w:left="-212" w:right="1343" w:firstLine="212"/>
-            <w:jc w:val="right"/>
-            <w:rPr>
-              <w:rFonts w:ascii="Times New Roman" w:eastAsia="Times New Roman" w:hAnsi="Times New Roman" w:cs="Times New Roman"/>
-              <w:sz w:val="24"/>
-              <w:szCs w:val="24"/>
-            </w:rPr>
-          </w:pPr>
-          <w:r>
-            <w:rPr>
-              <w:rFonts w:ascii="Times New Roman" w:eastAsia="Times New Roman" w:hAnsi="Times New Roman" w:cs="Times New Roman"/>
-              <w:color w:val="212121"/>
-              <w:sz w:val="23"/>
-              <w:szCs w:val="23"/>
-            </w:rPr>
-            <w:t xml:space="preserve">  “2026 Año de la Grandeza Argentina”</w:t>
-          </w:r>
-        </w:p>
-      </w:tc>
-    </w:tr>
-  </w:tbl>
+<w:hdr xmlns:wpc="http://schemas.microsoft.com/office/word/2010/wordprocessingCanvas" xmlns:cx="http://schemas.microsoft.com/office/drawing/2014/chartex" xmlns:mc="http://schemas.openxmlformats.org/markup-compatibility/2006" xmlns:o="urn:schemas-microsoft-com:office:office" xmlns:r="http://schemas.openxmlformats.org/officeDocument/2006/relationships" xmlns:m="http://schemas.openxmlformats.org/officeDocument/2006/math" xmlns:v="urn:schemas-microsoft-com:vml" xmlns:wp14="http://schemas.microsoft.com/office/word/2010/wordprocessingDrawing" xmlns:wp="http://schemas.openxmlformats.org/drawingml/2006/wordprocessingDrawing" xmlns:w10="urn:schemas-microsoft-com:office:word" xmlns:w="http://schemas.openxmlformats.org/wordprocessingml/2006/main" xmlns:w14="http://schemas.microsoft.com/office/word/2010/wordml" xmlns:w15="http://schemas.microsoft.com/office/word/2012/wordml" xmlns:w16se="http://schemas.microsoft.com/office/word/2015/wordml/symex" xmlns:wpg="http://schemas.microsoft.com/office/word/2010/wordprocessingGroup" xmlns:wpi="http://schemas.microsoft.com/office/word/2010/wordprocessingInk" xmlns:wne="http://schemas.microsoft.com/office/word/2006/wordml" xmlns:wps="http://schemas.microsoft.com/office/word/2010/wordprocessingShape" mc:Ignorable="w14 w15 w16se wp14">
   <w:p>
     <w:pPr>
       <w:tabs>
@@ -1973,14 +1770,14 @@
 </file>
 
 <file path=word/styles.xml><?xml version="1.0" encoding="utf-8"?>
-<w:styles xmlns:mc="http://schemas.openxmlformats.org/markup-compatibility/2006" xmlns:r="http://schemas.openxmlformats.org/officeDocument/2006/relationships" xmlns:w="http://schemas.openxmlformats.org/wordprocessingml/2006/main" xmlns:w14="http://schemas.microsoft.com/office/word/2010/wordml" xmlns:w15="http://schemas.microsoft.com/office/word/2012/wordml" xmlns:w16cex="http://schemas.microsoft.com/office/word/2018/wordml/cex" xmlns:w16cid="http://schemas.microsoft.com/office/word/2016/wordml/cid" xmlns:w16="http://schemas.microsoft.com/office/word/2018/wordml" xmlns:w16sdtdh="http://schemas.microsoft.com/office/word/2020/wordml/sdtdatahash" xmlns:w16se="http://schemas.microsoft.com/office/word/2015/wordml/symex" mc:Ignorable="w14 w15 w16se w16cid w16 w16cex w16sdtdh">
+<w:styles xmlns:mc="http://schemas.openxmlformats.org/markup-compatibility/2006" xmlns:r="http://schemas.openxmlformats.org/officeDocument/2006/relationships" xmlns:w="http://schemas.openxmlformats.org/wordprocessingml/2006/main" xmlns:w14="http://schemas.microsoft.com/office/word/2010/wordml" xmlns:w15="http://schemas.microsoft.com/office/word/2012/wordml" xmlns:w16se="http://schemas.microsoft.com/office/word/2015/wordml/symex" mc:Ignorable="w14 w15 w16se">
   <w:docDefaults>
     <w:rPrDefault>
       <w:rPr>
         <w:rFonts w:ascii="Arial" w:eastAsia="Arial" w:hAnsi="Arial" w:cs="Arial"/>
         <w:sz w:val="22"/>
         <w:szCs w:val="22"/>
-        <w:lang w:val="es" w:eastAsia="es-AR" w:bidi="ar-SA"/>
+        <w:lang w:val="es" w:eastAsia="en-US" w:bidi="ar-SA"/>
       </w:rPr>
     </w:rPrDefault>
     <w:pPrDefault>
@@ -1989,7 +1786,7 @@
       </w:pPr>
     </w:pPrDefault>
   </w:docDefaults>
-  <w:latentStyles w:defLockedState="0" w:defUIPriority="99" w:defSemiHidden="0" w:defUnhideWhenUsed="0" w:defQFormat="0" w:count="376">
+  <w:latentStyles w:defLockedState="0" w:defUIPriority="99" w:defSemiHidden="0" w:defUnhideWhenUsed="0" w:defQFormat="0" w:count="371">
     <w:lsdException w:name="Normal" w:uiPriority="0" w:qFormat="1"/>
     <w:lsdException w:name="heading 1" w:uiPriority="9" w:qFormat="1"/>
     <w:lsdException w:name="heading 2" w:semiHidden="1" w:uiPriority="9" w:unhideWhenUsed="1" w:qFormat="1"/>
@@ -2361,11 +2158,6 @@
     <w:lsdException w:name="List Table 5 Dark Accent 6" w:uiPriority="50"/>
     <w:lsdException w:name="List Table 6 Colorful Accent 6" w:uiPriority="51"/>
     <w:lsdException w:name="List Table 7 Colorful Accent 6" w:uiPriority="52"/>
-    <w:lsdException w:name="Mention" w:semiHidden="1" w:unhideWhenUsed="1"/>
-    <w:lsdException w:name="Smart Hyperlink" w:semiHidden="1" w:unhideWhenUsed="1"/>
-    <w:lsdException w:name="Hashtag" w:semiHidden="1" w:unhideWhenUsed="1"/>
-    <w:lsdException w:name="Unresolved Mention" w:semiHidden="1" w:unhideWhenUsed="1"/>
-    <w:lsdException w:name="Smart Link" w:semiHidden="1" w:unhideWhenUsed="1"/>
   </w:latentStyles>
   <w:style w:type="paragraph" w:default="1" w:styleId="Normal">
     <w:name w:val="Normal"/>
@@ -2541,19 +2333,6 @@
     <w:tblPr>
       <w:tblStyleRowBandSize w:val="1"/>
       <w:tblStyleColBandSize w:val="1"/>
-    </w:tblPr>
-  </w:style>
-  <w:style w:type="table" w:customStyle="1" w:styleId="a1">
-    <w:basedOn w:val="TableNormal"/>
-    <w:tblPr>
-      <w:tblStyleRowBandSize w:val="1"/>
-      <w:tblStyleColBandSize w:val="1"/>
-      <w:tblCellMar>
-        <w:top w:w="15" w:type="dxa"/>
-        <w:left w:w="15" w:type="dxa"/>
-        <w:bottom w:w="15" w:type="dxa"/>
-        <w:right w:w="15" w:type="dxa"/>
-      </w:tblCellMar>
     </w:tblPr>
   </w:style>
 </w:styles>
@@ -2885,6 +2664,10 @@
 </go:gDocsCustomXmlDataStorage>
 </file>
 
+<file path=customXml/item2.xml><?xml version="1.0" encoding="utf-8"?>
+<b:Sources xmlns:b="http://schemas.openxmlformats.org/officeDocument/2006/bibliography" xmlns="http://schemas.openxmlformats.org/officeDocument/2006/bibliography" SelectedStyle="\APASixthEditionOfficeOnline.xsl" StyleName="APA" Version="6"/>
+</file>
+
 <file path=customXml/itemProps1.xml><?xml version="1.0" encoding="utf-8"?>
 <ds:datastoreItem xmlns:ds="http://schemas.openxmlformats.org/officeDocument/2006/customXml" ds:itemID="{11111111-1234-1234-1234-123412341234}">
   <ds:schemaRefs>
@@ -2892,4 +2675,12 @@
     <ds:schemaRef ds:uri="http://schemas.openxmlformats.org/officeDocument/2006/relationships"/>
   </ds:schemaRefs>
 </ds:datastoreItem>
+</file>
+
+<file path=customXml/itemProps2.xml><?xml version="1.0" encoding="utf-8"?>
+<ds:datastoreItem xmlns:ds="http://schemas.openxmlformats.org/officeDocument/2006/customXml" ds:itemID="{855B288D-EF90-470D-A371-CD7DBEC5F2A9}">
+  <ds:schemaRefs>
+    <ds:schemaRef ds:uri="http://schemas.openxmlformats.org/officeDocument/2006/bibliography"/>
+  </ds:schemaRefs>
+</ds:datastoreItem>
 </file>
</xml_diff>